<commit_message>
divided on moduls, added while true and menu, random
</commit_message>
<xml_diff>
--- a/IGI/LR3/igi_3.docx
+++ b/IGI/LR3/igi_3.docx
@@ -789,10 +789,10 @@
           <w:lang w:eastAsia="ru-RU"/>
         </w:rPr>
         <w:drawing>
-          <wp:inline distT="0" distB="0" distL="0" distR="0" wp14:anchorId="552468BC" wp14:editId="64786F26">
-            <wp:extent cx="5940425" cy="810895"/>
-            <wp:effectExtent l="0" t="0" r="3175" b="8255"/>
-            <wp:docPr id="5" name="Рисунок 5"/>
+          <wp:inline distT="0" distB="0" distL="0" distR="0" wp14:anchorId="046423A7" wp14:editId="4D7CD20B">
+            <wp:extent cx="5940425" cy="5913755"/>
+            <wp:effectExtent l="0" t="0" r="3175" b="0"/>
+            <wp:docPr id="3" name="Рисунок 3"/>
             <wp:cNvGraphicFramePr>
               <a:graphicFrameLocks xmlns:a="http://schemas.openxmlformats.org/drawingml/2006/main" noChangeAspect="1"/>
             </wp:cNvGraphicFramePr>
@@ -812,7 +812,7 @@
                   <pic:spPr>
                     <a:xfrm>
                       <a:off x="0" y="0"/>
-                      <a:ext cx="5940425" cy="810895"/>
+                      <a:ext cx="5940425" cy="5913755"/>
                     </a:xfrm>
                     <a:prstGeom prst="rect">
                       <a:avLst/>
@@ -844,11 +844,12 @@
           <w:szCs w:val="24"/>
           <w:lang w:eastAsia="ru-RU"/>
         </w:rPr>
+        <w:lastRenderedPageBreak/>
         <w:drawing>
-          <wp:inline distT="0" distB="0" distL="0" distR="0" wp14:anchorId="35C14BA9" wp14:editId="0EA6BDA4">
-            <wp:extent cx="5940425" cy="858520"/>
+          <wp:inline distT="0" distB="0" distL="0" distR="0" wp14:anchorId="39EEF645" wp14:editId="003ABC64">
+            <wp:extent cx="3368717" cy="3800475"/>
             <wp:effectExtent l="0" t="0" r="3175" b="0"/>
-            <wp:docPr id="6" name="Рисунок 6"/>
+            <wp:docPr id="10" name="Рисунок 10"/>
             <wp:cNvGraphicFramePr>
               <a:graphicFrameLocks xmlns:a="http://schemas.openxmlformats.org/drawingml/2006/main" noChangeAspect="1"/>
             </wp:cNvGraphicFramePr>
@@ -868,7 +869,7 @@
                   <pic:spPr>
                     <a:xfrm>
                       <a:off x="0" y="0"/>
-                      <a:ext cx="5940425" cy="858520"/>
+                      <a:ext cx="3382152" cy="3815632"/>
                     </a:xfrm>
                     <a:prstGeom prst="rect">
                       <a:avLst/>
@@ -901,10 +902,10 @@
           <w:lang w:eastAsia="ru-RU"/>
         </w:rPr>
         <w:drawing>
-          <wp:inline distT="0" distB="0" distL="0" distR="0" wp14:anchorId="123090DB" wp14:editId="39233A03">
-            <wp:extent cx="5940425" cy="794385"/>
-            <wp:effectExtent l="0" t="0" r="3175" b="5715"/>
-            <wp:docPr id="7" name="Рисунок 7"/>
+          <wp:inline distT="0" distB="0" distL="0" distR="0" wp14:anchorId="6FECAE0E" wp14:editId="5951A48A">
+            <wp:extent cx="3367087" cy="2423367"/>
+            <wp:effectExtent l="0" t="0" r="5080" b="0"/>
+            <wp:docPr id="11" name="Рисунок 11"/>
             <wp:cNvGraphicFramePr>
               <a:graphicFrameLocks xmlns:a="http://schemas.openxmlformats.org/drawingml/2006/main" noChangeAspect="1"/>
             </wp:cNvGraphicFramePr>
@@ -924,7 +925,7 @@
                   <pic:spPr>
                     <a:xfrm>
                       <a:off x="0" y="0"/>
-                      <a:ext cx="5940425" cy="794385"/>
+                      <a:ext cx="3373125" cy="2427712"/>
                     </a:xfrm>
                     <a:prstGeom prst="rect">
                       <a:avLst/>
@@ -948,10 +949,7 @@
           <w:lang w:eastAsia="ru-RU"/>
         </w:rPr>
       </w:pPr>
-    </w:p>
-    <w:p>
-      <w:pPr>
-        <w:spacing w:after="0" w:line="240" w:lineRule="auto"/>
+      <w:r>
         <w:rPr>
           <w:rFonts w:ascii="Times New Roman" w:hAnsi="Times New Roman" w:cs="Times New Roman"/>
           <w:noProof/>
@@ -959,21 +957,11 @@
           <w:szCs w:val="24"/>
           <w:lang w:eastAsia="ru-RU"/>
         </w:rPr>
-      </w:pPr>
-      <w:r>
-        <w:rPr>
-          <w:rFonts w:ascii="Times New Roman" w:hAnsi="Times New Roman" w:cs="Times New Roman"/>
-          <w:noProof/>
-          <w:sz w:val="24"/>
-          <w:szCs w:val="24"/>
-          <w:lang w:eastAsia="ru-RU"/>
-        </w:rPr>
-        <w:lastRenderedPageBreak/>
         <w:drawing>
-          <wp:inline distT="0" distB="0" distL="0" distR="0" wp14:anchorId="5AE13E29" wp14:editId="0F1A02B9">
-            <wp:extent cx="5940425" cy="7981950"/>
+          <wp:inline distT="0" distB="0" distL="0" distR="0" wp14:anchorId="4049ED7A" wp14:editId="388D2788">
+            <wp:extent cx="5940425" cy="1228090"/>
             <wp:effectExtent l="0" t="0" r="3175" b="0"/>
-            <wp:docPr id="4" name="Рисунок 4"/>
+            <wp:docPr id="14" name="Рисунок 14"/>
             <wp:cNvGraphicFramePr>
               <a:graphicFrameLocks xmlns:a="http://schemas.openxmlformats.org/drawingml/2006/main" noChangeAspect="1"/>
             </wp:cNvGraphicFramePr>
@@ -993,7 +981,7 @@
                   <pic:spPr>
                     <a:xfrm>
                       <a:off x="0" y="0"/>
-                      <a:ext cx="5940425" cy="7981950"/>
+                      <a:ext cx="5940425" cy="1228090"/>
                     </a:xfrm>
                     <a:prstGeom prst="rect">
                       <a:avLst/>
@@ -1014,7 +1002,19 @@
           <w:noProof/>
           <w:sz w:val="24"/>
           <w:szCs w:val="24"/>
-          <w:lang w:val="en-US" w:eastAsia="ru-RU"/>
+          <w:lang w:eastAsia="ru-RU"/>
+        </w:rPr>
+      </w:pPr>
+    </w:p>
+    <w:p>
+      <w:pPr>
+        <w:spacing w:after="0" w:line="240" w:lineRule="auto"/>
+        <w:rPr>
+          <w:rFonts w:ascii="Times New Roman" w:hAnsi="Times New Roman" w:cs="Times New Roman"/>
+          <w:noProof/>
+          <w:sz w:val="24"/>
+          <w:szCs w:val="24"/>
+          <w:lang w:eastAsia="ru-RU"/>
         </w:rPr>
       </w:pPr>
       <w:r>
@@ -1027,10 +1027,10 @@
         </w:rPr>
         <w:lastRenderedPageBreak/>
         <w:drawing>
-          <wp:inline distT="0" distB="0" distL="0" distR="0" wp14:anchorId="48FEB4D6" wp14:editId="0887366B">
-            <wp:extent cx="5940425" cy="8247380"/>
-            <wp:effectExtent l="0" t="0" r="3175" b="1270"/>
-            <wp:docPr id="8" name="Рисунок 8"/>
+          <wp:inline distT="0" distB="0" distL="0" distR="0" wp14:anchorId="71C66CE6" wp14:editId="5C138AFF">
+            <wp:extent cx="2618700" cy="3181350"/>
+            <wp:effectExtent l="0" t="0" r="0" b="0"/>
+            <wp:docPr id="12" name="Рисунок 12"/>
             <wp:cNvGraphicFramePr>
               <a:graphicFrameLocks xmlns:a="http://schemas.openxmlformats.org/drawingml/2006/main" noChangeAspect="1"/>
             </wp:cNvGraphicFramePr>
@@ -1050,7 +1050,7 @@
                   <pic:spPr>
                     <a:xfrm>
                       <a:off x="0" y="0"/>
-                      <a:ext cx="5940425" cy="8247380"/>
+                      <a:ext cx="2624485" cy="3188378"/>
                     </a:xfrm>
                     <a:prstGeom prst="rect">
                       <a:avLst/>
@@ -1071,7 +1071,7 @@
           <w:noProof/>
           <w:sz w:val="24"/>
           <w:szCs w:val="24"/>
-          <w:lang w:val="en-US" w:eastAsia="ru-RU"/>
+          <w:lang w:eastAsia="ru-RU"/>
         </w:rPr>
       </w:pPr>
       <w:r>
@@ -1080,14 +1080,13 @@
           <w:noProof/>
           <w:sz w:val="24"/>
           <w:szCs w:val="24"/>
-          <w:lang w:val="en-US" w:eastAsia="ru-RU"/>
-        </w:rPr>
-        <w:lastRenderedPageBreak/>
+          <w:lang w:eastAsia="ru-RU"/>
+        </w:rPr>
         <w:drawing>
-          <wp:inline distT="0" distB="0" distL="0" distR="0" wp14:anchorId="18A582BA" wp14:editId="21CB69D5">
-            <wp:extent cx="5940425" cy="3691255"/>
-            <wp:effectExtent l="0" t="0" r="3175" b="4445"/>
-            <wp:docPr id="9" name="Рисунок 9"/>
+          <wp:inline distT="0" distB="0" distL="0" distR="0" wp14:anchorId="04126E38" wp14:editId="2B90A5AB">
+            <wp:extent cx="3179151" cy="2875339"/>
+            <wp:effectExtent l="0" t="0" r="2540" b="1270"/>
+            <wp:docPr id="13" name="Рисунок 13"/>
             <wp:cNvGraphicFramePr>
               <a:graphicFrameLocks xmlns:a="http://schemas.openxmlformats.org/drawingml/2006/main" noChangeAspect="1"/>
             </wp:cNvGraphicFramePr>
@@ -1107,7 +1106,7 @@
                   <pic:spPr>
                     <a:xfrm>
                       <a:off x="0" y="0"/>
-                      <a:ext cx="5940425" cy="3691255"/>
+                      <a:ext cx="3186055" cy="2881583"/>
                     </a:xfrm>
                     <a:prstGeom prst="rect">
                       <a:avLst/>
@@ -1122,6 +1121,78 @@
     </w:p>
     <w:p>
       <w:pPr>
+        <w:spacing w:after="0" w:line="240" w:lineRule="auto"/>
+        <w:rPr>
+          <w:rFonts w:ascii="Times New Roman" w:hAnsi="Times New Roman" w:cs="Times New Roman"/>
+          <w:noProof/>
+          <w:sz w:val="24"/>
+          <w:szCs w:val="24"/>
+          <w:lang w:eastAsia="ru-RU"/>
+        </w:rPr>
+      </w:pPr>
+    </w:p>
+    <w:p>
+      <w:pPr>
+        <w:spacing w:after="0" w:line="240" w:lineRule="auto"/>
+        <w:rPr>
+          <w:rFonts w:ascii="Times New Roman" w:hAnsi="Times New Roman" w:cs="Times New Roman"/>
+          <w:noProof/>
+          <w:sz w:val="24"/>
+          <w:szCs w:val="24"/>
+          <w:lang w:eastAsia="ru-RU"/>
+        </w:rPr>
+      </w:pPr>
+    </w:p>
+    <w:p>
+      <w:pPr>
+        <w:spacing w:after="0" w:line="240" w:lineRule="auto"/>
+        <w:rPr>
+          <w:rFonts w:ascii="Times New Roman" w:hAnsi="Times New Roman" w:cs="Times New Roman"/>
+          <w:noProof/>
+          <w:sz w:val="24"/>
+          <w:szCs w:val="24"/>
+          <w:lang w:eastAsia="ru-RU"/>
+        </w:rPr>
+      </w:pPr>
+    </w:p>
+    <w:p>
+      <w:pPr>
+        <w:spacing w:after="0" w:line="240" w:lineRule="auto"/>
+        <w:rPr>
+          <w:rFonts w:ascii="Times New Roman" w:hAnsi="Times New Roman" w:cs="Times New Roman"/>
+          <w:noProof/>
+          <w:sz w:val="24"/>
+          <w:szCs w:val="24"/>
+          <w:lang w:eastAsia="ru-RU"/>
+        </w:rPr>
+      </w:pPr>
+    </w:p>
+    <w:p>
+      <w:pPr>
+        <w:spacing w:after="0" w:line="240" w:lineRule="auto"/>
+        <w:rPr>
+          <w:rFonts w:ascii="Times New Roman" w:hAnsi="Times New Roman" w:cs="Times New Roman"/>
+          <w:noProof/>
+          <w:sz w:val="24"/>
+          <w:szCs w:val="24"/>
+          <w:lang w:val="en-US" w:eastAsia="ru-RU"/>
+        </w:rPr>
+      </w:pPr>
+    </w:p>
+    <w:p>
+      <w:pPr>
+        <w:spacing w:after="0" w:line="240" w:lineRule="auto"/>
+        <w:rPr>
+          <w:rFonts w:ascii="Times New Roman" w:hAnsi="Times New Roman" w:cs="Times New Roman"/>
+          <w:noProof/>
+          <w:sz w:val="24"/>
+          <w:szCs w:val="24"/>
+          <w:lang w:val="en-US" w:eastAsia="ru-RU"/>
+        </w:rPr>
+      </w:pPr>
+    </w:p>
+    <w:p>
+      <w:pPr>
         <w:rPr>
           <w:rFonts w:ascii="Times New Roman" w:hAnsi="Times New Roman" w:cs="Times New Roman"/>
           <w:sz w:val="24"/>
@@ -1220,15 +1291,7 @@
           <w:sz w:val="24"/>
           <w:szCs w:val="24"/>
         </w:rPr>
-        <w:t xml:space="preserve">28. </w:t>
-      </w:r>
-      <w:r>
-        <w:rPr>
-          <w:rFonts w:ascii="Times New Roman" w:hAnsi="Times New Roman" w:cs="Times New Roman"/>
-          <w:sz w:val="24"/>
-          <w:szCs w:val="24"/>
-        </w:rPr>
-        <w:t>В строке, вводимой с клавиатуры, подсчитать количество букв</w:t>
+        <w:t>28. В строке, вводимой с клавиатуры, подсчитать количество букв</w:t>
       </w:r>
     </w:p>
     <w:p>
@@ -1263,6 +1326,7 @@
           <w:sz w:val="24"/>
           <w:szCs w:val="24"/>
         </w:rPr>
+        <w:lastRenderedPageBreak/>
         <w:t>Задание 4. Не использовать регулярные выражения</w:t>
       </w:r>
       <w:r>
@@ -1344,15 +1408,7 @@
           <w:sz w:val="24"/>
           <w:szCs w:val="24"/>
         </w:rPr>
-        <w:t xml:space="preserve">28. </w:t>
-      </w:r>
-      <w:r>
-        <w:rPr>
-          <w:rFonts w:ascii="Times New Roman" w:hAnsi="Times New Roman" w:cs="Times New Roman"/>
-          <w:sz w:val="24"/>
-          <w:szCs w:val="24"/>
-        </w:rPr>
-        <w:t>а) определить количество слов в строке и вывести на экран все</w:t>
+        <w:t>28. а) определить количество слов в строке и вывести на экран все</w:t>
       </w:r>
     </w:p>
     <w:p>
@@ -1430,7 +1486,6 @@
           <w:sz w:val="24"/>
           <w:szCs w:val="24"/>
         </w:rPr>
-        <w:lastRenderedPageBreak/>
         <w:t xml:space="preserve">Задание 5. </w:t>
       </w:r>
       <w:r>

</xml_diff>

<commit_message>
task2 is done, list of inputting el without 1, find min
</commit_message>
<xml_diff>
--- a/IGI/LR3/igi_3.docx
+++ b/IGI/LR3/igi_3.docx
@@ -1245,10 +1245,165 @@
       <w:r>
         <w:rPr>
           <w:rFonts w:ascii="Times New Roman" w:hAnsi="Times New Roman" w:cs="Times New Roman"/>
+          <w:sz w:val="24"/>
+          <w:szCs w:val="24"/>
+        </w:rPr>
+        <w:lastRenderedPageBreak/>
+        <w:drawing>
+          <wp:inline distT="0" distB="0" distL="0" distR="0" wp14:anchorId="15436748" wp14:editId="3DABE552">
+            <wp:extent cx="4091015" cy="2750666"/>
+            <wp:effectExtent l="0" t="0" r="5080" b="0"/>
+            <wp:docPr id="4" name="Рисунок 4"/>
+            <wp:cNvGraphicFramePr>
+              <a:graphicFrameLocks xmlns:a="http://schemas.openxmlformats.org/drawingml/2006/main" noChangeAspect="1"/>
+            </wp:cNvGraphicFramePr>
+            <a:graphic xmlns:a="http://schemas.openxmlformats.org/drawingml/2006/main">
+              <a:graphicData uri="http://schemas.openxmlformats.org/drawingml/2006/picture">
+                <pic:pic xmlns:pic="http://schemas.openxmlformats.org/drawingml/2006/picture">
+                  <pic:nvPicPr>
+                    <pic:cNvPr id="1" name=""/>
+                    <pic:cNvPicPr/>
+                  </pic:nvPicPr>
+                  <pic:blipFill>
+                    <a:blip r:embed="rId13"/>
+                    <a:stretch>
+                      <a:fillRect/>
+                    </a:stretch>
+                  </pic:blipFill>
+                  <pic:spPr>
+                    <a:xfrm>
+                      <a:off x="0" y="0"/>
+                      <a:ext cx="4097374" cy="2754942"/>
+                    </a:xfrm>
+                    <a:prstGeom prst="rect">
+                      <a:avLst/>
+                    </a:prstGeom>
+                  </pic:spPr>
+                </pic:pic>
+              </a:graphicData>
+            </a:graphic>
+          </wp:inline>
+        </w:drawing>
+      </w:r>
+    </w:p>
+    <w:p>
+      <w:pPr>
+        <w:rPr>
+          <w:rFonts w:ascii="Times New Roman" w:hAnsi="Times New Roman" w:cs="Times New Roman"/>
+          <w:sz w:val="24"/>
+          <w:szCs w:val="24"/>
+        </w:rPr>
+      </w:pPr>
+      <w:r>
+        <w:rPr>
+          <w:rFonts w:ascii="Times New Roman" w:hAnsi="Times New Roman" w:cs="Times New Roman"/>
+          <w:sz w:val="24"/>
+          <w:szCs w:val="24"/>
+        </w:rPr>
+        <w:drawing>
+          <wp:inline distT="0" distB="0" distL="0" distR="0" wp14:anchorId="2645D021" wp14:editId="3E874A44">
+            <wp:extent cx="3980019" cy="2939385"/>
+            <wp:effectExtent l="0" t="0" r="1905" b="0"/>
+            <wp:docPr id="5" name="Рисунок 5"/>
+            <wp:cNvGraphicFramePr>
+              <a:graphicFrameLocks xmlns:a="http://schemas.openxmlformats.org/drawingml/2006/main" noChangeAspect="1"/>
+            </wp:cNvGraphicFramePr>
+            <a:graphic xmlns:a="http://schemas.openxmlformats.org/drawingml/2006/main">
+              <a:graphicData uri="http://schemas.openxmlformats.org/drawingml/2006/picture">
+                <pic:pic xmlns:pic="http://schemas.openxmlformats.org/drawingml/2006/picture">
+                  <pic:nvPicPr>
+                    <pic:cNvPr id="1" name=""/>
+                    <pic:cNvPicPr/>
+                  </pic:nvPicPr>
+                  <pic:blipFill>
+                    <a:blip r:embed="rId14"/>
+                    <a:stretch>
+                      <a:fillRect/>
+                    </a:stretch>
+                  </pic:blipFill>
+                  <pic:spPr>
+                    <a:xfrm>
+                      <a:off x="0" y="0"/>
+                      <a:ext cx="3988287" cy="2945491"/>
+                    </a:xfrm>
+                    <a:prstGeom prst="rect">
+                      <a:avLst/>
+                    </a:prstGeom>
+                  </pic:spPr>
+                </pic:pic>
+              </a:graphicData>
+            </a:graphic>
+          </wp:inline>
+        </w:drawing>
+      </w:r>
+    </w:p>
+    <w:p>
+      <w:pPr>
+        <w:rPr>
+          <w:rFonts w:ascii="Times New Roman" w:hAnsi="Times New Roman" w:cs="Times New Roman"/>
+          <w:sz w:val="24"/>
+          <w:szCs w:val="24"/>
+        </w:rPr>
+      </w:pPr>
+      <w:r>
+        <w:rPr>
+          <w:rFonts w:ascii="Times New Roman" w:hAnsi="Times New Roman" w:cs="Times New Roman"/>
+          <w:sz w:val="24"/>
+          <w:szCs w:val="24"/>
+        </w:rPr>
+        <w:drawing>
+          <wp:inline distT="0" distB="0" distL="0" distR="0" wp14:anchorId="15849B31" wp14:editId="68AE8649">
+            <wp:extent cx="3721027" cy="3258037"/>
+            <wp:effectExtent l="0" t="0" r="0" b="0"/>
+            <wp:docPr id="6" name="Рисунок 6"/>
+            <wp:cNvGraphicFramePr>
+              <a:graphicFrameLocks xmlns:a="http://schemas.openxmlformats.org/drawingml/2006/main" noChangeAspect="1"/>
+            </wp:cNvGraphicFramePr>
+            <a:graphic xmlns:a="http://schemas.openxmlformats.org/drawingml/2006/main">
+              <a:graphicData uri="http://schemas.openxmlformats.org/drawingml/2006/picture">
+                <pic:pic xmlns:pic="http://schemas.openxmlformats.org/drawingml/2006/picture">
+                  <pic:nvPicPr>
+                    <pic:cNvPr id="1" name=""/>
+                    <pic:cNvPicPr/>
+                  </pic:nvPicPr>
+                  <pic:blipFill>
+                    <a:blip r:embed="rId15"/>
+                    <a:stretch>
+                      <a:fillRect/>
+                    </a:stretch>
+                  </pic:blipFill>
+                  <pic:spPr>
+                    <a:xfrm>
+                      <a:off x="0" y="0"/>
+                      <a:ext cx="3728720" cy="3264773"/>
+                    </a:xfrm>
+                    <a:prstGeom prst="rect">
+                      <a:avLst/>
+                    </a:prstGeom>
+                  </pic:spPr>
+                </pic:pic>
+              </a:graphicData>
+            </a:graphic>
+          </wp:inline>
+        </w:drawing>
+      </w:r>
+    </w:p>
+    <w:p>
+      <w:pPr>
+        <w:rPr>
+          <w:rFonts w:ascii="Times New Roman" w:hAnsi="Times New Roman" w:cs="Times New Roman"/>
+          <w:sz w:val="24"/>
+          <w:szCs w:val="24"/>
+        </w:rPr>
+      </w:pPr>
+      <w:r>
+        <w:rPr>
+          <w:rFonts w:ascii="Times New Roman" w:hAnsi="Times New Roman" w:cs="Times New Roman"/>
           <w:b/>
           <w:sz w:val="24"/>
           <w:szCs w:val="24"/>
         </w:rPr>
+        <w:lastRenderedPageBreak/>
         <w:t>Задание 3.</w:t>
       </w:r>
       <w:r>
@@ -1326,7 +1481,6 @@
           <w:sz w:val="24"/>
           <w:szCs w:val="24"/>
         </w:rPr>
-        <w:lastRenderedPageBreak/>
         <w:t>Задание 4. Не использовать регулярные выражения</w:t>
       </w:r>
       <w:r>

</xml_diff>

<commit_message>
task3 is done, entering string, cout of chars in lower case and count of num
</commit_message>
<xml_diff>
--- a/IGI/LR3/igi_3.docx
+++ b/IGI/LR3/igi_3.docx
@@ -498,25 +498,7 @@
           <w:sz w:val="24"/>
           <w:szCs w:val="24"/>
         </w:rPr>
-        <w:t xml:space="preserve"> В соответствии с заданием своего варианта составить программу для вычисления значения функции c помощью разложения функции в степенной ряд. Задать точность вычислений </w:t>
-      </w:r>
-      <w:proofErr w:type="spellStart"/>
-      <w:r>
-        <w:rPr>
-          <w:rFonts w:ascii="Times New Roman" w:hAnsi="Times New Roman" w:cs="Times New Roman"/>
-          <w:sz w:val="24"/>
-          <w:szCs w:val="24"/>
-        </w:rPr>
-        <w:t>eps</w:t>
-      </w:r>
-      <w:proofErr w:type="spellEnd"/>
-      <w:r>
-        <w:rPr>
-          <w:rFonts w:ascii="Times New Roman" w:hAnsi="Times New Roman" w:cs="Times New Roman"/>
-          <w:sz w:val="24"/>
-          <w:szCs w:val="24"/>
-        </w:rPr>
-        <w:t xml:space="preserve">. </w:t>
+        <w:t xml:space="preserve"> В соответствии с заданием своего варианта составить программу для вычисления значения функции c помощью разложения функции в степенной ряд. Задать точность вычислений eps. </w:t>
       </w:r>
     </w:p>
     <w:p>
@@ -651,43 +633,7 @@
           <w:sz w:val="24"/>
           <w:szCs w:val="24"/>
         </w:rPr>
-        <w:t xml:space="preserve">Здесь x – значение аргумента, F(x) – значение функции, n – количество просуммированных членов ряда, </w:t>
-      </w:r>
-      <w:proofErr w:type="spellStart"/>
-      <w:r>
-        <w:rPr>
-          <w:rFonts w:ascii="Times New Roman" w:hAnsi="Times New Roman" w:cs="Times New Roman"/>
-          <w:sz w:val="24"/>
-          <w:szCs w:val="24"/>
-        </w:rPr>
-        <w:t>Math</w:t>
-      </w:r>
-      <w:proofErr w:type="spellEnd"/>
-      <w:r>
-        <w:rPr>
-          <w:rFonts w:ascii="Times New Roman" w:hAnsi="Times New Roman" w:cs="Times New Roman"/>
-          <w:sz w:val="24"/>
-          <w:szCs w:val="24"/>
-        </w:rPr>
-        <w:t xml:space="preserve"> F(x) – значение функции, вычисленное с помощью модуля </w:t>
-      </w:r>
-      <w:proofErr w:type="spellStart"/>
-      <w:r>
-        <w:rPr>
-          <w:rFonts w:ascii="Times New Roman" w:hAnsi="Times New Roman" w:cs="Times New Roman"/>
-          <w:sz w:val="24"/>
-          <w:szCs w:val="24"/>
-        </w:rPr>
-        <w:t>math</w:t>
-      </w:r>
-      <w:proofErr w:type="spellEnd"/>
-      <w:r>
-        <w:rPr>
-          <w:rFonts w:ascii="Times New Roman" w:hAnsi="Times New Roman" w:cs="Times New Roman"/>
-          <w:sz w:val="24"/>
-          <w:szCs w:val="24"/>
-        </w:rPr>
-        <w:t>.</w:t>
+        <w:t>Здесь x – значение аргумента, F(x) – значение функции, n – количество просуммированных членов ряда, Math F(x) – значение функции, вычисленное с помощью модуля math.</w:t>
       </w:r>
     </w:p>
     <w:p>
@@ -1245,6 +1191,7 @@
       <w:r>
         <w:rPr>
           <w:rFonts w:ascii="Times New Roman" w:hAnsi="Times New Roman" w:cs="Times New Roman"/>
+          <w:noProof/>
           <w:sz w:val="24"/>
           <w:szCs w:val="24"/>
         </w:rPr>
@@ -1297,6 +1244,7 @@
       <w:r>
         <w:rPr>
           <w:rFonts w:ascii="Times New Roman" w:hAnsi="Times New Roman" w:cs="Times New Roman"/>
+          <w:noProof/>
           <w:sz w:val="24"/>
           <w:szCs w:val="24"/>
         </w:rPr>
@@ -1348,6 +1296,7 @@
       <w:r>
         <w:rPr>
           <w:rFonts w:ascii="Times New Roman" w:hAnsi="Times New Roman" w:cs="Times New Roman"/>
+          <w:noProof/>
           <w:sz w:val="24"/>
           <w:szCs w:val="24"/>
         </w:rPr>
@@ -1477,10 +1426,164 @@
       <w:r>
         <w:rPr>
           <w:rFonts w:ascii="Times New Roman" w:hAnsi="Times New Roman" w:cs="Times New Roman"/>
+          <w:sz w:val="24"/>
+          <w:szCs w:val="24"/>
+        </w:rPr>
+        <w:drawing>
+          <wp:inline distT="0" distB="0" distL="0" distR="0" wp14:anchorId="53715E30" wp14:editId="7695937F">
+            <wp:extent cx="2626918" cy="926933"/>
+            <wp:effectExtent l="0" t="0" r="2540" b="6985"/>
+            <wp:docPr id="7" name="Рисунок 7"/>
+            <wp:cNvGraphicFramePr>
+              <a:graphicFrameLocks xmlns:a="http://schemas.openxmlformats.org/drawingml/2006/main" noChangeAspect="1"/>
+            </wp:cNvGraphicFramePr>
+            <a:graphic xmlns:a="http://schemas.openxmlformats.org/drawingml/2006/main">
+              <a:graphicData uri="http://schemas.openxmlformats.org/drawingml/2006/picture">
+                <pic:pic xmlns:pic="http://schemas.openxmlformats.org/drawingml/2006/picture">
+                  <pic:nvPicPr>
+                    <pic:cNvPr id="1" name=""/>
+                    <pic:cNvPicPr/>
+                  </pic:nvPicPr>
+                  <pic:blipFill>
+                    <a:blip r:embed="rId16"/>
+                    <a:stretch>
+                      <a:fillRect/>
+                    </a:stretch>
+                  </pic:blipFill>
+                  <pic:spPr>
+                    <a:xfrm>
+                      <a:off x="0" y="0"/>
+                      <a:ext cx="2638940" cy="931175"/>
+                    </a:xfrm>
+                    <a:prstGeom prst="rect">
+                      <a:avLst/>
+                    </a:prstGeom>
+                  </pic:spPr>
+                </pic:pic>
+              </a:graphicData>
+            </a:graphic>
+          </wp:inline>
+        </w:drawing>
+      </w:r>
+    </w:p>
+    <w:p>
+      <w:pPr>
+        <w:rPr>
+          <w:rFonts w:ascii="Times New Roman" w:hAnsi="Times New Roman" w:cs="Times New Roman"/>
+          <w:sz w:val="24"/>
+          <w:szCs w:val="24"/>
+        </w:rPr>
+      </w:pPr>
+      <w:r>
+        <w:rPr>
+          <w:rFonts w:ascii="Times New Roman" w:hAnsi="Times New Roman" w:cs="Times New Roman"/>
+          <w:sz w:val="24"/>
+          <w:szCs w:val="24"/>
+        </w:rPr>
+        <w:drawing>
+          <wp:inline distT="0" distB="0" distL="0" distR="0" wp14:anchorId="2AAF1389" wp14:editId="28E778EB">
+            <wp:extent cx="2554966" cy="4471574"/>
+            <wp:effectExtent l="0" t="0" r="0" b="5715"/>
+            <wp:docPr id="8" name="Рисунок 8"/>
+            <wp:cNvGraphicFramePr>
+              <a:graphicFrameLocks xmlns:a="http://schemas.openxmlformats.org/drawingml/2006/main" noChangeAspect="1"/>
+            </wp:cNvGraphicFramePr>
+            <a:graphic xmlns:a="http://schemas.openxmlformats.org/drawingml/2006/main">
+              <a:graphicData uri="http://schemas.openxmlformats.org/drawingml/2006/picture">
+                <pic:pic xmlns:pic="http://schemas.openxmlformats.org/drawingml/2006/picture">
+                  <pic:nvPicPr>
+                    <pic:cNvPr id="1" name=""/>
+                    <pic:cNvPicPr/>
+                  </pic:nvPicPr>
+                  <pic:blipFill>
+                    <a:blip r:embed="rId17"/>
+                    <a:stretch>
+                      <a:fillRect/>
+                    </a:stretch>
+                  </pic:blipFill>
+                  <pic:spPr>
+                    <a:xfrm>
+                      <a:off x="0" y="0"/>
+                      <a:ext cx="2561300" cy="4482659"/>
+                    </a:xfrm>
+                    <a:prstGeom prst="rect">
+                      <a:avLst/>
+                    </a:prstGeom>
+                  </pic:spPr>
+                </pic:pic>
+              </a:graphicData>
+            </a:graphic>
+          </wp:inline>
+        </w:drawing>
+      </w:r>
+    </w:p>
+    <w:p>
+      <w:pPr>
+        <w:rPr>
+          <w:rFonts w:ascii="Times New Roman" w:hAnsi="Times New Roman" w:cs="Times New Roman"/>
+          <w:sz w:val="24"/>
+          <w:szCs w:val="24"/>
+        </w:rPr>
+      </w:pPr>
+      <w:r>
+        <w:rPr>
+          <w:rFonts w:ascii="Times New Roman" w:hAnsi="Times New Roman" w:cs="Times New Roman"/>
+          <w:sz w:val="24"/>
+          <w:szCs w:val="24"/>
+        </w:rPr>
+        <w:drawing>
+          <wp:inline distT="0" distB="0" distL="0" distR="0" wp14:anchorId="34FF2581" wp14:editId="0D7FC3CC">
+            <wp:extent cx="5940425" cy="2181225"/>
+            <wp:effectExtent l="0" t="0" r="3175" b="9525"/>
+            <wp:docPr id="9" name="Рисунок 9"/>
+            <wp:cNvGraphicFramePr>
+              <a:graphicFrameLocks xmlns:a="http://schemas.openxmlformats.org/drawingml/2006/main" noChangeAspect="1"/>
+            </wp:cNvGraphicFramePr>
+            <a:graphic xmlns:a="http://schemas.openxmlformats.org/drawingml/2006/main">
+              <a:graphicData uri="http://schemas.openxmlformats.org/drawingml/2006/picture">
+                <pic:pic xmlns:pic="http://schemas.openxmlformats.org/drawingml/2006/picture">
+                  <pic:nvPicPr>
+                    <pic:cNvPr id="1" name=""/>
+                    <pic:cNvPicPr/>
+                  </pic:nvPicPr>
+                  <pic:blipFill>
+                    <a:blip r:embed="rId18"/>
+                    <a:stretch>
+                      <a:fillRect/>
+                    </a:stretch>
+                  </pic:blipFill>
+                  <pic:spPr>
+                    <a:xfrm>
+                      <a:off x="0" y="0"/>
+                      <a:ext cx="5940425" cy="2181225"/>
+                    </a:xfrm>
+                    <a:prstGeom prst="rect">
+                      <a:avLst/>
+                    </a:prstGeom>
+                  </pic:spPr>
+                </pic:pic>
+              </a:graphicData>
+            </a:graphic>
+          </wp:inline>
+        </w:drawing>
+      </w:r>
+    </w:p>
+    <w:p>
+      <w:pPr>
+        <w:rPr>
+          <w:rFonts w:ascii="Times New Roman" w:hAnsi="Times New Roman" w:cs="Times New Roman"/>
+          <w:sz w:val="24"/>
+          <w:szCs w:val="24"/>
+        </w:rPr>
+      </w:pPr>
+      <w:r>
+        <w:rPr>
+          <w:rFonts w:ascii="Times New Roman" w:hAnsi="Times New Roman" w:cs="Times New Roman"/>
           <w:b/>
           <w:sz w:val="24"/>
           <w:szCs w:val="24"/>
         </w:rPr>
+        <w:lastRenderedPageBreak/>
         <w:t>Задание 4. Не использовать регулярные выражения</w:t>
       </w:r>
       <w:r>
@@ -1508,27 +1611,7 @@
           <w:szCs w:val="24"/>
           <w:lang w:val="en-US"/>
         </w:rPr>
-        <w:t xml:space="preserve">«So she was considering in her own mind, as well as she could, for the hot day made her feel very sleepy and stupid, whether the pleasure of making a daisy-chain would be worth the trouble of getting up and picking the daisies, when suddenly a White Rabbit with pink eyes ran close by </w:t>
-      </w:r>
-      <w:proofErr w:type="gramStart"/>
-      <w:r>
-        <w:rPr>
-          <w:rFonts w:ascii="Times New Roman" w:hAnsi="Times New Roman" w:cs="Times New Roman"/>
-          <w:sz w:val="24"/>
-          <w:szCs w:val="24"/>
-          <w:lang w:val="en-US"/>
-        </w:rPr>
-        <w:t>her.»</w:t>
-      </w:r>
-      <w:proofErr w:type="gramEnd"/>
-      <w:r>
-        <w:rPr>
-          <w:rFonts w:ascii="Times New Roman" w:hAnsi="Times New Roman" w:cs="Times New Roman"/>
-          <w:sz w:val="24"/>
-          <w:szCs w:val="24"/>
-          <w:lang w:val="en-US"/>
-        </w:rPr>
-        <w:t xml:space="preserve"> </w:t>
+        <w:t xml:space="preserve">«So she was considering in her own mind, as well as she could, for the hot day made her feel very sleepy and stupid, whether the pleasure of making a daisy-chain would be worth the trouble of getting up and picking the daisies, when suddenly a White Rabbit with pink eyes ran close by her.» </w:t>
       </w:r>
     </w:p>
     <w:p>

</xml_diff>

<commit_message>
task4 is almost done, find a word with i and min len, list of words with an odd number of letters
</commit_message>
<xml_diff>
--- a/IGI/LR3/igi_3.docx
+++ b/IGI/LR3/igi_3.docx
@@ -498,7 +498,25 @@
           <w:sz w:val="24"/>
           <w:szCs w:val="24"/>
         </w:rPr>
-        <w:t xml:space="preserve"> В соответствии с заданием своего варианта составить программу для вычисления значения функции c помощью разложения функции в степенной ряд. Задать точность вычислений eps. </w:t>
+        <w:t xml:space="preserve"> В соответствии с заданием своего варианта составить программу для вычисления значения функции c помощью разложения функции в степенной ряд. Задать точность вычислений </w:t>
+      </w:r>
+      <w:proofErr w:type="spellStart"/>
+      <w:r>
+        <w:rPr>
+          <w:rFonts w:ascii="Times New Roman" w:hAnsi="Times New Roman" w:cs="Times New Roman"/>
+          <w:sz w:val="24"/>
+          <w:szCs w:val="24"/>
+        </w:rPr>
+        <w:t>eps</w:t>
+      </w:r>
+      <w:proofErr w:type="spellEnd"/>
+      <w:r>
+        <w:rPr>
+          <w:rFonts w:ascii="Times New Roman" w:hAnsi="Times New Roman" w:cs="Times New Roman"/>
+          <w:sz w:val="24"/>
+          <w:szCs w:val="24"/>
+        </w:rPr>
+        <w:t xml:space="preserve">. </w:t>
       </w:r>
     </w:p>
     <w:p>
@@ -633,7 +651,43 @@
           <w:sz w:val="24"/>
           <w:szCs w:val="24"/>
         </w:rPr>
-        <w:t>Здесь x – значение аргумента, F(x) – значение функции, n – количество просуммированных членов ряда, Math F(x) – значение функции, вычисленное с помощью модуля math.</w:t>
+        <w:t xml:space="preserve">Здесь x – значение аргумента, F(x) – значение функции, n – количество просуммированных членов ряда, </w:t>
+      </w:r>
+      <w:proofErr w:type="spellStart"/>
+      <w:r>
+        <w:rPr>
+          <w:rFonts w:ascii="Times New Roman" w:hAnsi="Times New Roman" w:cs="Times New Roman"/>
+          <w:sz w:val="24"/>
+          <w:szCs w:val="24"/>
+        </w:rPr>
+        <w:t>Math</w:t>
+      </w:r>
+      <w:proofErr w:type="spellEnd"/>
+      <w:r>
+        <w:rPr>
+          <w:rFonts w:ascii="Times New Roman" w:hAnsi="Times New Roman" w:cs="Times New Roman"/>
+          <w:sz w:val="24"/>
+          <w:szCs w:val="24"/>
+        </w:rPr>
+        <w:t xml:space="preserve"> F(x) – значение функции, вычисленное с помощью модуля </w:t>
+      </w:r>
+      <w:proofErr w:type="spellStart"/>
+      <w:r>
+        <w:rPr>
+          <w:rFonts w:ascii="Times New Roman" w:hAnsi="Times New Roman" w:cs="Times New Roman"/>
+          <w:sz w:val="24"/>
+          <w:szCs w:val="24"/>
+        </w:rPr>
+        <w:t>math</w:t>
+      </w:r>
+      <w:proofErr w:type="spellEnd"/>
+      <w:r>
+        <w:rPr>
+          <w:rFonts w:ascii="Times New Roman" w:hAnsi="Times New Roman" w:cs="Times New Roman"/>
+          <w:sz w:val="24"/>
+          <w:szCs w:val="24"/>
+        </w:rPr>
+        <w:t>.</w:t>
       </w:r>
     </w:p>
     <w:p>
@@ -1426,6 +1480,7 @@
       <w:r>
         <w:rPr>
           <w:rFonts w:ascii="Times New Roman" w:hAnsi="Times New Roman" w:cs="Times New Roman"/>
+          <w:noProof/>
           <w:sz w:val="24"/>
           <w:szCs w:val="24"/>
         </w:rPr>
@@ -1477,6 +1532,7 @@
       <w:r>
         <w:rPr>
           <w:rFonts w:ascii="Times New Roman" w:hAnsi="Times New Roman" w:cs="Times New Roman"/>
+          <w:noProof/>
           <w:sz w:val="24"/>
           <w:szCs w:val="24"/>
         </w:rPr>
@@ -1528,6 +1584,7 @@
       <w:r>
         <w:rPr>
           <w:rFonts w:ascii="Times New Roman" w:hAnsi="Times New Roman" w:cs="Times New Roman"/>
+          <w:noProof/>
           <w:sz w:val="24"/>
           <w:szCs w:val="24"/>
         </w:rPr>
@@ -1679,6 +1736,108 @@
           <w:sz w:val="24"/>
           <w:szCs w:val="24"/>
         </w:rPr>
+        <w:drawing>
+          <wp:inline distT="0" distB="0" distL="0" distR="0" wp14:anchorId="461C6071" wp14:editId="5349F042">
+            <wp:extent cx="2505350" cy="2512581"/>
+            <wp:effectExtent l="0" t="0" r="0" b="2540"/>
+            <wp:docPr id="15" name="Рисунок 15"/>
+            <wp:cNvGraphicFramePr>
+              <a:graphicFrameLocks xmlns:a="http://schemas.openxmlformats.org/drawingml/2006/main" noChangeAspect="1"/>
+            </wp:cNvGraphicFramePr>
+            <a:graphic xmlns:a="http://schemas.openxmlformats.org/drawingml/2006/main">
+              <a:graphicData uri="http://schemas.openxmlformats.org/drawingml/2006/picture">
+                <pic:pic xmlns:pic="http://schemas.openxmlformats.org/drawingml/2006/picture">
+                  <pic:nvPicPr>
+                    <pic:cNvPr id="1" name=""/>
+                    <pic:cNvPicPr/>
+                  </pic:nvPicPr>
+                  <pic:blipFill>
+                    <a:blip r:embed="rId19"/>
+                    <a:stretch>
+                      <a:fillRect/>
+                    </a:stretch>
+                  </pic:blipFill>
+                  <pic:spPr>
+                    <a:xfrm>
+                      <a:off x="0" y="0"/>
+                      <a:ext cx="2512327" cy="2519578"/>
+                    </a:xfrm>
+                    <a:prstGeom prst="rect">
+                      <a:avLst/>
+                    </a:prstGeom>
+                  </pic:spPr>
+                </pic:pic>
+              </a:graphicData>
+            </a:graphic>
+          </wp:inline>
+        </w:drawing>
+      </w:r>
+    </w:p>
+    <w:p>
+      <w:pPr>
+        <w:rPr>
+          <w:rFonts w:ascii="Times New Roman" w:hAnsi="Times New Roman" w:cs="Times New Roman"/>
+          <w:sz w:val="24"/>
+          <w:szCs w:val="24"/>
+        </w:rPr>
+      </w:pPr>
+      <w:r>
+        <w:rPr>
+          <w:rFonts w:ascii="Times New Roman" w:hAnsi="Times New Roman" w:cs="Times New Roman"/>
+          <w:sz w:val="24"/>
+          <w:szCs w:val="24"/>
+        </w:rPr>
+        <w:drawing>
+          <wp:inline distT="0" distB="0" distL="0" distR="0" wp14:anchorId="79C19AE2" wp14:editId="08B4C7F2">
+            <wp:extent cx="2034936" cy="1656447"/>
+            <wp:effectExtent l="0" t="0" r="3810" b="1270"/>
+            <wp:docPr id="16" name="Рисунок 16"/>
+            <wp:cNvGraphicFramePr>
+              <a:graphicFrameLocks xmlns:a="http://schemas.openxmlformats.org/drawingml/2006/main" noChangeAspect="1"/>
+            </wp:cNvGraphicFramePr>
+            <a:graphic xmlns:a="http://schemas.openxmlformats.org/drawingml/2006/main">
+              <a:graphicData uri="http://schemas.openxmlformats.org/drawingml/2006/picture">
+                <pic:pic xmlns:pic="http://schemas.openxmlformats.org/drawingml/2006/picture">
+                  <pic:nvPicPr>
+                    <pic:cNvPr id="1" name=""/>
+                    <pic:cNvPicPr/>
+                  </pic:nvPicPr>
+                  <pic:blipFill>
+                    <a:blip r:embed="rId20"/>
+                    <a:stretch>
+                      <a:fillRect/>
+                    </a:stretch>
+                  </pic:blipFill>
+                  <pic:spPr>
+                    <a:xfrm>
+                      <a:off x="0" y="0"/>
+                      <a:ext cx="2044308" cy="1664076"/>
+                    </a:xfrm>
+                    <a:prstGeom prst="rect">
+                      <a:avLst/>
+                    </a:prstGeom>
+                  </pic:spPr>
+                </pic:pic>
+              </a:graphicData>
+            </a:graphic>
+          </wp:inline>
+        </w:drawing>
+      </w:r>
+    </w:p>
+    <w:p>
+      <w:pPr>
+        <w:rPr>
+          <w:rFonts w:ascii="Times New Roman" w:hAnsi="Times New Roman" w:cs="Times New Roman"/>
+          <w:sz w:val="24"/>
+          <w:szCs w:val="24"/>
+        </w:rPr>
+      </w:pPr>
+      <w:r>
+        <w:rPr>
+          <w:rFonts w:ascii="Times New Roman" w:hAnsi="Times New Roman" w:cs="Times New Roman"/>
+          <w:sz w:val="24"/>
+          <w:szCs w:val="24"/>
+        </w:rPr>
         <w:t>б) найти самое короткое слово, которое начинается на букву 'i';</w:t>
       </w:r>
     </w:p>
@@ -1696,6 +1855,57 @@
           <w:sz w:val="24"/>
           <w:szCs w:val="24"/>
         </w:rPr>
+        <w:drawing>
+          <wp:inline distT="0" distB="0" distL="0" distR="0" wp14:anchorId="73CD01B5" wp14:editId="27A916A5">
+            <wp:extent cx="3985304" cy="379147"/>
+            <wp:effectExtent l="0" t="0" r="0" b="1905"/>
+            <wp:docPr id="17" name="Рисунок 17"/>
+            <wp:cNvGraphicFramePr>
+              <a:graphicFrameLocks xmlns:a="http://schemas.openxmlformats.org/drawingml/2006/main" noChangeAspect="1"/>
+            </wp:cNvGraphicFramePr>
+            <a:graphic xmlns:a="http://schemas.openxmlformats.org/drawingml/2006/main">
+              <a:graphicData uri="http://schemas.openxmlformats.org/drawingml/2006/picture">
+                <pic:pic xmlns:pic="http://schemas.openxmlformats.org/drawingml/2006/picture">
+                  <pic:nvPicPr>
+                    <pic:cNvPr id="1" name=""/>
+                    <pic:cNvPicPr/>
+                  </pic:nvPicPr>
+                  <pic:blipFill>
+                    <a:blip r:embed="rId21"/>
+                    <a:stretch>
+                      <a:fillRect/>
+                    </a:stretch>
+                  </pic:blipFill>
+                  <pic:spPr>
+                    <a:xfrm>
+                      <a:off x="0" y="0"/>
+                      <a:ext cx="4026619" cy="383078"/>
+                    </a:xfrm>
+                    <a:prstGeom prst="rect">
+                      <a:avLst/>
+                    </a:prstGeom>
+                  </pic:spPr>
+                </pic:pic>
+              </a:graphicData>
+            </a:graphic>
+          </wp:inline>
+        </w:drawing>
+      </w:r>
+    </w:p>
+    <w:p>
+      <w:pPr>
+        <w:rPr>
+          <w:rFonts w:ascii="Times New Roman" w:hAnsi="Times New Roman" w:cs="Times New Roman"/>
+          <w:sz w:val="24"/>
+          <w:szCs w:val="24"/>
+        </w:rPr>
+      </w:pPr>
+      <w:r>
+        <w:rPr>
+          <w:rFonts w:ascii="Times New Roman" w:hAnsi="Times New Roman" w:cs="Times New Roman"/>
+          <w:sz w:val="24"/>
+          <w:szCs w:val="24"/>
+        </w:rPr>
         <w:t>в) вывести повторяющиеся слова</w:t>
       </w:r>
     </w:p>
@@ -1765,6 +1975,7 @@
           <w:sz w:val="24"/>
           <w:szCs w:val="24"/>
         </w:rPr>
+        <w:lastRenderedPageBreak/>
         <w:t>2) проверка корректности вводимых данных;</w:t>
       </w:r>
     </w:p>

</xml_diff>

<commit_message>
task4 is done, added reteated words
</commit_message>
<xml_diff>
--- a/IGI/LR3/igi_3.docx
+++ b/IGI/LR3/igi_3.docx
@@ -498,25 +498,7 @@
           <w:sz w:val="24"/>
           <w:szCs w:val="24"/>
         </w:rPr>
-        <w:t xml:space="preserve"> В соответствии с заданием своего варианта составить программу для вычисления значения функции c помощью разложения функции в степенной ряд. Задать точность вычислений </w:t>
-      </w:r>
-      <w:proofErr w:type="spellStart"/>
-      <w:r>
-        <w:rPr>
-          <w:rFonts w:ascii="Times New Roman" w:hAnsi="Times New Roman" w:cs="Times New Roman"/>
-          <w:sz w:val="24"/>
-          <w:szCs w:val="24"/>
-        </w:rPr>
-        <w:t>eps</w:t>
-      </w:r>
-      <w:proofErr w:type="spellEnd"/>
-      <w:r>
-        <w:rPr>
-          <w:rFonts w:ascii="Times New Roman" w:hAnsi="Times New Roman" w:cs="Times New Roman"/>
-          <w:sz w:val="24"/>
-          <w:szCs w:val="24"/>
-        </w:rPr>
-        <w:t xml:space="preserve">. </w:t>
+        <w:t xml:space="preserve"> В соответствии с заданием своего варианта составить программу для вычисления значения функции c помощью разложения функции в степенной ряд. Задать точность вычислений eps. </w:t>
       </w:r>
     </w:p>
     <w:p>
@@ -651,43 +633,7 @@
           <w:sz w:val="24"/>
           <w:szCs w:val="24"/>
         </w:rPr>
-        <w:t xml:space="preserve">Здесь x – значение аргумента, F(x) – значение функции, n – количество просуммированных членов ряда, </w:t>
-      </w:r>
-      <w:proofErr w:type="spellStart"/>
-      <w:r>
-        <w:rPr>
-          <w:rFonts w:ascii="Times New Roman" w:hAnsi="Times New Roman" w:cs="Times New Roman"/>
-          <w:sz w:val="24"/>
-          <w:szCs w:val="24"/>
-        </w:rPr>
-        <w:t>Math</w:t>
-      </w:r>
-      <w:proofErr w:type="spellEnd"/>
-      <w:r>
-        <w:rPr>
-          <w:rFonts w:ascii="Times New Roman" w:hAnsi="Times New Roman" w:cs="Times New Roman"/>
-          <w:sz w:val="24"/>
-          <w:szCs w:val="24"/>
-        </w:rPr>
-        <w:t xml:space="preserve"> F(x) – значение функции, вычисленное с помощью модуля </w:t>
-      </w:r>
-      <w:proofErr w:type="spellStart"/>
-      <w:r>
-        <w:rPr>
-          <w:rFonts w:ascii="Times New Roman" w:hAnsi="Times New Roman" w:cs="Times New Roman"/>
-          <w:sz w:val="24"/>
-          <w:szCs w:val="24"/>
-        </w:rPr>
-        <w:t>math</w:t>
-      </w:r>
-      <w:proofErr w:type="spellEnd"/>
-      <w:r>
-        <w:rPr>
-          <w:rFonts w:ascii="Times New Roman" w:hAnsi="Times New Roman" w:cs="Times New Roman"/>
-          <w:sz w:val="24"/>
-          <w:szCs w:val="24"/>
-        </w:rPr>
-        <w:t>.</w:t>
+        <w:t>Здесь x – значение аргумента, F(x) – значение функции, n – количество просуммированных членов ряда, Math F(x) – значение функции, вычисленное с помощью модуля math.</w:t>
       </w:r>
     </w:p>
     <w:p>
@@ -1733,6 +1679,7 @@
       <w:r>
         <w:rPr>
           <w:rFonts w:ascii="Times New Roman" w:hAnsi="Times New Roman" w:cs="Times New Roman"/>
+          <w:noProof/>
           <w:sz w:val="24"/>
           <w:szCs w:val="24"/>
         </w:rPr>
@@ -1784,6 +1731,7 @@
       <w:r>
         <w:rPr>
           <w:rFonts w:ascii="Times New Roman" w:hAnsi="Times New Roman" w:cs="Times New Roman"/>
+          <w:noProof/>
           <w:sz w:val="24"/>
           <w:szCs w:val="24"/>
         </w:rPr>
@@ -1852,6 +1800,7 @@
       <w:r>
         <w:rPr>
           <w:rFonts w:ascii="Times New Roman" w:hAnsi="Times New Roman" w:cs="Times New Roman"/>
+          <w:noProof/>
           <w:sz w:val="24"/>
           <w:szCs w:val="24"/>
         </w:rPr>
@@ -1906,6 +1855,109 @@
           <w:sz w:val="24"/>
           <w:szCs w:val="24"/>
         </w:rPr>
+        <w:lastRenderedPageBreak/>
+        <w:drawing>
+          <wp:inline distT="0" distB="0" distL="0" distR="0" wp14:anchorId="677B70AB" wp14:editId="7F82B938">
+            <wp:extent cx="2653346" cy="2691919"/>
+            <wp:effectExtent l="0" t="0" r="0" b="0"/>
+            <wp:docPr id="18" name="Рисунок 18"/>
+            <wp:cNvGraphicFramePr>
+              <a:graphicFrameLocks xmlns:a="http://schemas.openxmlformats.org/drawingml/2006/main" noChangeAspect="1"/>
+            </wp:cNvGraphicFramePr>
+            <a:graphic xmlns:a="http://schemas.openxmlformats.org/drawingml/2006/main">
+              <a:graphicData uri="http://schemas.openxmlformats.org/drawingml/2006/picture">
+                <pic:pic xmlns:pic="http://schemas.openxmlformats.org/drawingml/2006/picture">
+                  <pic:nvPicPr>
+                    <pic:cNvPr id="1" name=""/>
+                    <pic:cNvPicPr/>
+                  </pic:nvPicPr>
+                  <pic:blipFill>
+                    <a:blip r:embed="rId22"/>
+                    <a:stretch>
+                      <a:fillRect/>
+                    </a:stretch>
+                  </pic:blipFill>
+                  <pic:spPr>
+                    <a:xfrm>
+                      <a:off x="0" y="0"/>
+                      <a:ext cx="2658018" cy="2696658"/>
+                    </a:xfrm>
+                    <a:prstGeom prst="rect">
+                      <a:avLst/>
+                    </a:prstGeom>
+                  </pic:spPr>
+                </pic:pic>
+              </a:graphicData>
+            </a:graphic>
+          </wp:inline>
+        </w:drawing>
+      </w:r>
+    </w:p>
+    <w:p>
+      <w:pPr>
+        <w:rPr>
+          <w:rFonts w:ascii="Times New Roman" w:hAnsi="Times New Roman" w:cs="Times New Roman"/>
+          <w:sz w:val="24"/>
+          <w:szCs w:val="24"/>
+        </w:rPr>
+      </w:pPr>
+      <w:r>
+        <w:rPr>
+          <w:rFonts w:ascii="Times New Roman" w:hAnsi="Times New Roman" w:cs="Times New Roman"/>
+          <w:sz w:val="24"/>
+          <w:szCs w:val="24"/>
+        </w:rPr>
+        <w:drawing>
+          <wp:inline distT="0" distB="0" distL="0" distR="0" wp14:anchorId="7F3B7C1E" wp14:editId="32390CD2">
+            <wp:extent cx="2637489" cy="3096195"/>
+            <wp:effectExtent l="0" t="0" r="0" b="9525"/>
+            <wp:docPr id="19" name="Рисунок 19"/>
+            <wp:cNvGraphicFramePr>
+              <a:graphicFrameLocks xmlns:a="http://schemas.openxmlformats.org/drawingml/2006/main" noChangeAspect="1"/>
+            </wp:cNvGraphicFramePr>
+            <a:graphic xmlns:a="http://schemas.openxmlformats.org/drawingml/2006/main">
+              <a:graphicData uri="http://schemas.openxmlformats.org/drawingml/2006/picture">
+                <pic:pic xmlns:pic="http://schemas.openxmlformats.org/drawingml/2006/picture">
+                  <pic:nvPicPr>
+                    <pic:cNvPr id="1" name=""/>
+                    <pic:cNvPicPr/>
+                  </pic:nvPicPr>
+                  <pic:blipFill>
+                    <a:blip r:embed="rId23"/>
+                    <a:stretch>
+                      <a:fillRect/>
+                    </a:stretch>
+                  </pic:blipFill>
+                  <pic:spPr>
+                    <a:xfrm>
+                      <a:off x="0" y="0"/>
+                      <a:ext cx="2646744" cy="3107060"/>
+                    </a:xfrm>
+                    <a:prstGeom prst="rect">
+                      <a:avLst/>
+                    </a:prstGeom>
+                  </pic:spPr>
+                </pic:pic>
+              </a:graphicData>
+            </a:graphic>
+          </wp:inline>
+        </w:drawing>
+      </w:r>
+    </w:p>
+    <w:p>
+      <w:pPr>
+        <w:rPr>
+          <w:rFonts w:ascii="Times New Roman" w:hAnsi="Times New Roman" w:cs="Times New Roman"/>
+          <w:sz w:val="24"/>
+          <w:szCs w:val="24"/>
+        </w:rPr>
+      </w:pPr>
+      <w:r>
+        <w:rPr>
+          <w:rFonts w:ascii="Times New Roman" w:hAnsi="Times New Roman" w:cs="Times New Roman"/>
+          <w:sz w:val="24"/>
+          <w:szCs w:val="24"/>
+        </w:rPr>
         <w:t>в) вывести повторяющиеся слова</w:t>
       </w:r>
     </w:p>
@@ -1915,8 +1967,159 @@
           <w:rFonts w:ascii="Times New Roman" w:hAnsi="Times New Roman" w:cs="Times New Roman"/>
           <w:sz w:val="24"/>
           <w:szCs w:val="24"/>
-        </w:rPr>
-      </w:pPr>
+          <w:lang w:val="en-US"/>
+        </w:rPr>
+      </w:pPr>
+      <w:r>
+        <w:rPr>
+          <w:rFonts w:ascii="Times New Roman" w:hAnsi="Times New Roman" w:cs="Times New Roman"/>
+          <w:sz w:val="24"/>
+          <w:szCs w:val="24"/>
+          <w:lang w:val="en-US"/>
+        </w:rPr>
+        <w:drawing>
+          <wp:inline distT="0" distB="0" distL="0" distR="0" wp14:anchorId="528DC45D" wp14:editId="45EB0790">
+            <wp:extent cx="2949336" cy="2495349"/>
+            <wp:effectExtent l="0" t="0" r="3810" b="635"/>
+            <wp:docPr id="20" name="Рисунок 20"/>
+            <wp:cNvGraphicFramePr>
+              <a:graphicFrameLocks xmlns:a="http://schemas.openxmlformats.org/drawingml/2006/main" noChangeAspect="1"/>
+            </wp:cNvGraphicFramePr>
+            <a:graphic xmlns:a="http://schemas.openxmlformats.org/drawingml/2006/main">
+              <a:graphicData uri="http://schemas.openxmlformats.org/drawingml/2006/picture">
+                <pic:pic xmlns:pic="http://schemas.openxmlformats.org/drawingml/2006/picture">
+                  <pic:nvPicPr>
+                    <pic:cNvPr id="1" name=""/>
+                    <pic:cNvPicPr/>
+                  </pic:nvPicPr>
+                  <pic:blipFill>
+                    <a:blip r:embed="rId24"/>
+                    <a:stretch>
+                      <a:fillRect/>
+                    </a:stretch>
+                  </pic:blipFill>
+                  <pic:spPr>
+                    <a:xfrm>
+                      <a:off x="0" y="0"/>
+                      <a:ext cx="2955273" cy="2500372"/>
+                    </a:xfrm>
+                    <a:prstGeom prst="rect">
+                      <a:avLst/>
+                    </a:prstGeom>
+                  </pic:spPr>
+                </pic:pic>
+              </a:graphicData>
+            </a:graphic>
+          </wp:inline>
+        </w:drawing>
+      </w:r>
+    </w:p>
+    <w:p>
+      <w:pPr>
+        <w:rPr>
+          <w:rFonts w:ascii="Times New Roman" w:hAnsi="Times New Roman" w:cs="Times New Roman"/>
+          <w:sz w:val="24"/>
+          <w:szCs w:val="24"/>
+          <w:lang w:val="en-US"/>
+        </w:rPr>
+      </w:pPr>
+      <w:r>
+        <w:rPr>
+          <w:rFonts w:ascii="Times New Roman" w:hAnsi="Times New Roman" w:cs="Times New Roman"/>
+          <w:sz w:val="24"/>
+          <w:szCs w:val="24"/>
+          <w:lang w:val="en-US"/>
+        </w:rPr>
+        <w:lastRenderedPageBreak/>
+        <w:drawing>
+          <wp:inline distT="0" distB="0" distL="0" distR="0" wp14:anchorId="26AAD84E" wp14:editId="7510945E">
+            <wp:extent cx="3155473" cy="2335489"/>
+            <wp:effectExtent l="0" t="0" r="6985" b="8255"/>
+            <wp:docPr id="21" name="Рисунок 21"/>
+            <wp:cNvGraphicFramePr>
+              <a:graphicFrameLocks xmlns:a="http://schemas.openxmlformats.org/drawingml/2006/main" noChangeAspect="1"/>
+            </wp:cNvGraphicFramePr>
+            <a:graphic xmlns:a="http://schemas.openxmlformats.org/drawingml/2006/main">
+              <a:graphicData uri="http://schemas.openxmlformats.org/drawingml/2006/picture">
+                <pic:pic xmlns:pic="http://schemas.openxmlformats.org/drawingml/2006/picture">
+                  <pic:nvPicPr>
+                    <pic:cNvPr id="1" name=""/>
+                    <pic:cNvPicPr/>
+                  </pic:nvPicPr>
+                  <pic:blipFill>
+                    <a:blip r:embed="rId25"/>
+                    <a:stretch>
+                      <a:fillRect/>
+                    </a:stretch>
+                  </pic:blipFill>
+                  <pic:spPr>
+                    <a:xfrm>
+                      <a:off x="0" y="0"/>
+                      <a:ext cx="3162215" cy="2340479"/>
+                    </a:xfrm>
+                    <a:prstGeom prst="rect">
+                      <a:avLst/>
+                    </a:prstGeom>
+                  </pic:spPr>
+                </pic:pic>
+              </a:graphicData>
+            </a:graphic>
+          </wp:inline>
+        </w:drawing>
+      </w:r>
+    </w:p>
+    <w:p>
+      <w:pPr>
+        <w:rPr>
+          <w:rFonts w:ascii="Times New Roman" w:hAnsi="Times New Roman" w:cs="Times New Roman"/>
+          <w:sz w:val="24"/>
+          <w:szCs w:val="24"/>
+          <w:lang w:val="en-US"/>
+        </w:rPr>
+      </w:pPr>
+      <w:r>
+        <w:rPr>
+          <w:rFonts w:ascii="Times New Roman" w:hAnsi="Times New Roman" w:cs="Times New Roman"/>
+          <w:sz w:val="24"/>
+          <w:szCs w:val="24"/>
+          <w:lang w:val="en-US"/>
+        </w:rPr>
+        <w:drawing>
+          <wp:inline distT="0" distB="0" distL="0" distR="0" wp14:anchorId="58C4BEB2" wp14:editId="2CDA935A">
+            <wp:extent cx="3097332" cy="1452816"/>
+            <wp:effectExtent l="0" t="0" r="8255" b="0"/>
+            <wp:docPr id="22" name="Рисунок 22"/>
+            <wp:cNvGraphicFramePr>
+              <a:graphicFrameLocks xmlns:a="http://schemas.openxmlformats.org/drawingml/2006/main" noChangeAspect="1"/>
+            </wp:cNvGraphicFramePr>
+            <a:graphic xmlns:a="http://schemas.openxmlformats.org/drawingml/2006/main">
+              <a:graphicData uri="http://schemas.openxmlformats.org/drawingml/2006/picture">
+                <pic:pic xmlns:pic="http://schemas.openxmlformats.org/drawingml/2006/picture">
+                  <pic:nvPicPr>
+                    <pic:cNvPr id="1" name=""/>
+                    <pic:cNvPicPr/>
+                  </pic:nvPicPr>
+                  <pic:blipFill>
+                    <a:blip r:embed="rId26"/>
+                    <a:stretch>
+                      <a:fillRect/>
+                    </a:stretch>
+                  </pic:blipFill>
+                  <pic:spPr>
+                    <a:xfrm>
+                      <a:off x="0" y="0"/>
+                      <a:ext cx="3106025" cy="1456894"/>
+                    </a:xfrm>
+                    <a:prstGeom prst="rect">
+                      <a:avLst/>
+                    </a:prstGeom>
+                  </pic:spPr>
+                </pic:pic>
+              </a:graphicData>
+            </a:graphic>
+          </wp:inline>
+        </w:drawing>
+      </w:r>
     </w:p>
     <w:p>
       <w:pPr>
@@ -1975,7 +2178,6 @@
           <w:sz w:val="24"/>
           <w:szCs w:val="24"/>
         </w:rPr>
-        <w:lastRenderedPageBreak/>
         <w:t>2) проверка корректности вводимых данных;</w:t>
       </w:r>
     </w:p>

</xml_diff>

<commit_message>
task5 is done, max, list, sum of positive nums
</commit_message>
<xml_diff>
--- a/IGI/LR3/igi_3.docx
+++ b/IGI/LR3/igi_3.docx
@@ -1852,6 +1852,7 @@
       <w:r>
         <w:rPr>
           <w:rFonts w:ascii="Times New Roman" w:hAnsi="Times New Roman" w:cs="Times New Roman"/>
+          <w:noProof/>
           <w:sz w:val="24"/>
           <w:szCs w:val="24"/>
         </w:rPr>
@@ -1904,6 +1905,7 @@
       <w:r>
         <w:rPr>
           <w:rFonts w:ascii="Times New Roman" w:hAnsi="Times New Roman" w:cs="Times New Roman"/>
+          <w:noProof/>
           <w:sz w:val="24"/>
           <w:szCs w:val="24"/>
         </w:rPr>
@@ -1973,6 +1975,7 @@
       <w:r>
         <w:rPr>
           <w:rFonts w:ascii="Times New Roman" w:hAnsi="Times New Roman" w:cs="Times New Roman"/>
+          <w:noProof/>
           <w:sz w:val="24"/>
           <w:szCs w:val="24"/>
           <w:lang w:val="en-US"/>
@@ -2026,6 +2029,7 @@
       <w:r>
         <w:rPr>
           <w:rFonts w:ascii="Times New Roman" w:hAnsi="Times New Roman" w:cs="Times New Roman"/>
+          <w:noProof/>
           <w:sz w:val="24"/>
           <w:szCs w:val="24"/>
           <w:lang w:val="en-US"/>
@@ -2080,6 +2084,7 @@
       <w:r>
         <w:rPr>
           <w:rFonts w:ascii="Times New Roman" w:hAnsi="Times New Roman" w:cs="Times New Roman"/>
+          <w:noProof/>
           <w:sz w:val="24"/>
           <w:szCs w:val="24"/>
           <w:lang w:val="en-US"/>
@@ -2161,6 +2166,57 @@
           <w:sz w:val="24"/>
           <w:szCs w:val="24"/>
         </w:rPr>
+        <w:drawing>
+          <wp:inline distT="0" distB="0" distL="0" distR="0" wp14:anchorId="67F498E3" wp14:editId="02E4F66B">
+            <wp:extent cx="2790770" cy="1910134"/>
+            <wp:effectExtent l="0" t="0" r="0" b="0"/>
+            <wp:docPr id="23" name="Рисунок 23"/>
+            <wp:cNvGraphicFramePr>
+              <a:graphicFrameLocks xmlns:a="http://schemas.openxmlformats.org/drawingml/2006/main" noChangeAspect="1"/>
+            </wp:cNvGraphicFramePr>
+            <a:graphic xmlns:a="http://schemas.openxmlformats.org/drawingml/2006/main">
+              <a:graphicData uri="http://schemas.openxmlformats.org/drawingml/2006/picture">
+                <pic:pic xmlns:pic="http://schemas.openxmlformats.org/drawingml/2006/picture">
+                  <pic:nvPicPr>
+                    <pic:cNvPr id="1" name=""/>
+                    <pic:cNvPicPr/>
+                  </pic:nvPicPr>
+                  <pic:blipFill>
+                    <a:blip r:embed="rId27"/>
+                    <a:stretch>
+                      <a:fillRect/>
+                    </a:stretch>
+                  </pic:blipFill>
+                  <pic:spPr>
+                    <a:xfrm>
+                      <a:off x="0" y="0"/>
+                      <a:ext cx="2796606" cy="1914129"/>
+                    </a:xfrm>
+                    <a:prstGeom prst="rect">
+                      <a:avLst/>
+                    </a:prstGeom>
+                  </pic:spPr>
+                </pic:pic>
+              </a:graphicData>
+            </a:graphic>
+          </wp:inline>
+        </w:drawing>
+      </w:r>
+    </w:p>
+    <w:p>
+      <w:pPr>
+        <w:rPr>
+          <w:rFonts w:ascii="Times New Roman" w:hAnsi="Times New Roman" w:cs="Times New Roman"/>
+          <w:sz w:val="24"/>
+          <w:szCs w:val="24"/>
+        </w:rPr>
+      </w:pPr>
+      <w:r>
+        <w:rPr>
+          <w:rFonts w:ascii="Times New Roman" w:hAnsi="Times New Roman" w:cs="Times New Roman"/>
+          <w:sz w:val="24"/>
+          <w:szCs w:val="24"/>
+        </w:rPr>
         <w:t>1) ввод элементов списка пользователем;</w:t>
       </w:r>
     </w:p>
@@ -2178,6 +2234,58 @@
           <w:sz w:val="24"/>
           <w:szCs w:val="24"/>
         </w:rPr>
+        <w:lastRenderedPageBreak/>
+        <w:drawing>
+          <wp:inline distT="0" distB="0" distL="0" distR="0" wp14:anchorId="685CEE7D" wp14:editId="58FE89AA">
+            <wp:extent cx="3710456" cy="2336933"/>
+            <wp:effectExtent l="0" t="0" r="4445" b="6350"/>
+            <wp:docPr id="26" name="Рисунок 26"/>
+            <wp:cNvGraphicFramePr>
+              <a:graphicFrameLocks xmlns:a="http://schemas.openxmlformats.org/drawingml/2006/main" noChangeAspect="1"/>
+            </wp:cNvGraphicFramePr>
+            <a:graphic xmlns:a="http://schemas.openxmlformats.org/drawingml/2006/main">
+              <a:graphicData uri="http://schemas.openxmlformats.org/drawingml/2006/picture">
+                <pic:pic xmlns:pic="http://schemas.openxmlformats.org/drawingml/2006/picture">
+                  <pic:nvPicPr>
+                    <pic:cNvPr id="1" name=""/>
+                    <pic:cNvPicPr/>
+                  </pic:nvPicPr>
+                  <pic:blipFill>
+                    <a:blip r:embed="rId28"/>
+                    <a:stretch>
+                      <a:fillRect/>
+                    </a:stretch>
+                  </pic:blipFill>
+                  <pic:spPr>
+                    <a:xfrm>
+                      <a:off x="0" y="0"/>
+                      <a:ext cx="3714148" cy="2339258"/>
+                    </a:xfrm>
+                    <a:prstGeom prst="rect">
+                      <a:avLst/>
+                    </a:prstGeom>
+                  </pic:spPr>
+                </pic:pic>
+              </a:graphicData>
+            </a:graphic>
+          </wp:inline>
+        </w:drawing>
+      </w:r>
+    </w:p>
+    <w:p>
+      <w:pPr>
+        <w:rPr>
+          <w:rFonts w:ascii="Times New Roman" w:hAnsi="Times New Roman" w:cs="Times New Roman"/>
+          <w:sz w:val="24"/>
+          <w:szCs w:val="24"/>
+        </w:rPr>
+      </w:pPr>
+      <w:r>
+        <w:rPr>
+          <w:rFonts w:ascii="Times New Roman" w:hAnsi="Times New Roman" w:cs="Times New Roman"/>
+          <w:sz w:val="24"/>
+          <w:szCs w:val="24"/>
+        </w:rPr>
         <w:t>2) проверка корректности вводимых данных;</w:t>
       </w:r>
     </w:p>
@@ -2212,6 +2320,109 @@
           <w:sz w:val="24"/>
           <w:szCs w:val="24"/>
         </w:rPr>
+        <w:drawing>
+          <wp:inline distT="0" distB="0" distL="0" distR="0" wp14:anchorId="07FF6754" wp14:editId="1AD32491">
+            <wp:extent cx="2107376" cy="4165012"/>
+            <wp:effectExtent l="0" t="0" r="7620" b="6985"/>
+            <wp:docPr id="24" name="Рисунок 24"/>
+            <wp:cNvGraphicFramePr>
+              <a:graphicFrameLocks xmlns:a="http://schemas.openxmlformats.org/drawingml/2006/main" noChangeAspect="1"/>
+            </wp:cNvGraphicFramePr>
+            <a:graphic xmlns:a="http://schemas.openxmlformats.org/drawingml/2006/main">
+              <a:graphicData uri="http://schemas.openxmlformats.org/drawingml/2006/picture">
+                <pic:pic xmlns:pic="http://schemas.openxmlformats.org/drawingml/2006/picture">
+                  <pic:nvPicPr>
+                    <pic:cNvPr id="1" name=""/>
+                    <pic:cNvPicPr/>
+                  </pic:nvPicPr>
+                  <pic:blipFill>
+                    <a:blip r:embed="rId29"/>
+                    <a:stretch>
+                      <a:fillRect/>
+                    </a:stretch>
+                  </pic:blipFill>
+                  <pic:spPr>
+                    <a:xfrm>
+                      <a:off x="0" y="0"/>
+                      <a:ext cx="2113405" cy="4176928"/>
+                    </a:xfrm>
+                    <a:prstGeom prst="rect">
+                      <a:avLst/>
+                    </a:prstGeom>
+                  </pic:spPr>
+                </pic:pic>
+              </a:graphicData>
+            </a:graphic>
+          </wp:inline>
+        </w:drawing>
+      </w:r>
+    </w:p>
+    <w:p>
+      <w:pPr>
+        <w:rPr>
+          <w:rFonts w:ascii="Times New Roman" w:hAnsi="Times New Roman" w:cs="Times New Roman"/>
+          <w:sz w:val="24"/>
+          <w:szCs w:val="24"/>
+        </w:rPr>
+      </w:pPr>
+      <w:r>
+        <w:rPr>
+          <w:rFonts w:ascii="Times New Roman" w:hAnsi="Times New Roman" w:cs="Times New Roman"/>
+          <w:sz w:val="24"/>
+          <w:szCs w:val="24"/>
+        </w:rPr>
+        <w:lastRenderedPageBreak/>
+        <w:drawing>
+          <wp:inline distT="0" distB="0" distL="0" distR="0" wp14:anchorId="276AA78C" wp14:editId="37848F75">
+            <wp:extent cx="2272786" cy="2427544"/>
+            <wp:effectExtent l="0" t="0" r="0" b="0"/>
+            <wp:docPr id="25" name="Рисунок 25"/>
+            <wp:cNvGraphicFramePr>
+              <a:graphicFrameLocks xmlns:a="http://schemas.openxmlformats.org/drawingml/2006/main" noChangeAspect="1"/>
+            </wp:cNvGraphicFramePr>
+            <a:graphic xmlns:a="http://schemas.openxmlformats.org/drawingml/2006/main">
+              <a:graphicData uri="http://schemas.openxmlformats.org/drawingml/2006/picture">
+                <pic:pic xmlns:pic="http://schemas.openxmlformats.org/drawingml/2006/picture">
+                  <pic:nvPicPr>
+                    <pic:cNvPr id="1" name=""/>
+                    <pic:cNvPicPr/>
+                  </pic:nvPicPr>
+                  <pic:blipFill>
+                    <a:blip r:embed="rId30"/>
+                    <a:stretch>
+                      <a:fillRect/>
+                    </a:stretch>
+                  </pic:blipFill>
+                  <pic:spPr>
+                    <a:xfrm>
+                      <a:off x="0" y="0"/>
+                      <a:ext cx="2277295" cy="2432360"/>
+                    </a:xfrm>
+                    <a:prstGeom prst="rect">
+                      <a:avLst/>
+                    </a:prstGeom>
+                  </pic:spPr>
+                </pic:pic>
+              </a:graphicData>
+            </a:graphic>
+          </wp:inline>
+        </w:drawing>
+      </w:r>
+    </w:p>
+    <w:p>
+      <w:pPr>
+        <w:rPr>
+          <w:rFonts w:ascii="Times New Roman" w:hAnsi="Times New Roman" w:cs="Times New Roman"/>
+          <w:sz w:val="24"/>
+          <w:szCs w:val="24"/>
+        </w:rPr>
+      </w:pPr>
+      <w:r>
+        <w:rPr>
+          <w:rFonts w:ascii="Times New Roman" w:hAnsi="Times New Roman" w:cs="Times New Roman"/>
+          <w:sz w:val="24"/>
+          <w:szCs w:val="24"/>
+        </w:rPr>
         <w:t>4) вывод списка на экран.</w:t>
       </w:r>
     </w:p>
@@ -2229,10 +2440,105 @@
           <w:sz w:val="24"/>
           <w:szCs w:val="24"/>
         </w:rPr>
+        <w:drawing>
+          <wp:inline distT="0" distB="0" distL="0" distR="0" wp14:anchorId="5AC5019D" wp14:editId="5214DF8C">
+            <wp:extent cx="3457484" cy="1701947"/>
+            <wp:effectExtent l="0" t="0" r="0" b="0"/>
+            <wp:docPr id="27" name="Рисунок 27"/>
+            <wp:cNvGraphicFramePr>
+              <a:graphicFrameLocks xmlns:a="http://schemas.openxmlformats.org/drawingml/2006/main" noChangeAspect="1"/>
+            </wp:cNvGraphicFramePr>
+            <a:graphic xmlns:a="http://schemas.openxmlformats.org/drawingml/2006/main">
+              <a:graphicData uri="http://schemas.openxmlformats.org/drawingml/2006/picture">
+                <pic:pic xmlns:pic="http://schemas.openxmlformats.org/drawingml/2006/picture">
+                  <pic:nvPicPr>
+                    <pic:cNvPr id="1" name=""/>
+                    <pic:cNvPicPr/>
+                  </pic:nvPicPr>
+                  <pic:blipFill>
+                    <a:blip r:embed="rId31"/>
+                    <a:stretch>
+                      <a:fillRect/>
+                    </a:stretch>
+                  </pic:blipFill>
+                  <pic:spPr>
+                    <a:xfrm>
+                      <a:off x="0" y="0"/>
+                      <a:ext cx="3466818" cy="1706542"/>
+                    </a:xfrm>
+                    <a:prstGeom prst="rect">
+                      <a:avLst/>
+                    </a:prstGeom>
+                  </pic:spPr>
+                </pic:pic>
+              </a:graphicData>
+            </a:graphic>
+          </wp:inline>
+        </w:drawing>
+      </w:r>
+    </w:p>
+    <w:p>
+      <w:r>
+        <w:rPr>
+          <w:rFonts w:ascii="Times New Roman" w:hAnsi="Times New Roman" w:cs="Times New Roman"/>
+          <w:sz w:val="24"/>
+          <w:szCs w:val="24"/>
+        </w:rPr>
         <w:t xml:space="preserve">3. </w:t>
       </w:r>
       <w:r>
         <w:t>Найти максимальный по модулю элемент списка и сумму элементов списка расположенных до последнего положительного элемента</w:t>
+      </w:r>
+    </w:p>
+    <w:p>
+      <w:pPr>
+        <w:rPr>
+          <w:rFonts w:ascii="Times New Roman" w:hAnsi="Times New Roman" w:cs="Times New Roman"/>
+          <w:sz w:val="24"/>
+          <w:szCs w:val="24"/>
+        </w:rPr>
+      </w:pPr>
+      <w:r>
+        <w:rPr>
+          <w:rFonts w:ascii="Times New Roman" w:hAnsi="Times New Roman" w:cs="Times New Roman"/>
+          <w:sz w:val="24"/>
+          <w:szCs w:val="24"/>
+        </w:rPr>
+        <w:drawing>
+          <wp:inline distT="0" distB="0" distL="0" distR="0" wp14:anchorId="03D643F4" wp14:editId="39DB59E0">
+            <wp:extent cx="3361609" cy="1399622"/>
+            <wp:effectExtent l="0" t="0" r="0" b="0"/>
+            <wp:docPr id="28" name="Рисунок 28"/>
+            <wp:cNvGraphicFramePr>
+              <a:graphicFrameLocks xmlns:a="http://schemas.openxmlformats.org/drawingml/2006/main" noChangeAspect="1"/>
+            </wp:cNvGraphicFramePr>
+            <a:graphic xmlns:a="http://schemas.openxmlformats.org/drawingml/2006/main">
+              <a:graphicData uri="http://schemas.openxmlformats.org/drawingml/2006/picture">
+                <pic:pic xmlns:pic="http://schemas.openxmlformats.org/drawingml/2006/picture">
+                  <pic:nvPicPr>
+                    <pic:cNvPr id="1" name=""/>
+                    <pic:cNvPicPr/>
+                  </pic:nvPicPr>
+                  <pic:blipFill>
+                    <a:blip r:embed="rId32"/>
+                    <a:stretch>
+                      <a:fillRect/>
+                    </a:stretch>
+                  </pic:blipFill>
+                  <pic:spPr>
+                    <a:xfrm>
+                      <a:off x="0" y="0"/>
+                      <a:ext cx="3374261" cy="1404890"/>
+                    </a:xfrm>
+                    <a:prstGeom prst="rect">
+                      <a:avLst/>
+                    </a:prstGeom>
+                  </pic:spPr>
+                </pic:pic>
+              </a:graphicData>
+            </a:graphic>
+          </wp:inline>
+        </w:drawing>
       </w:r>
     </w:p>
     <w:p>

</xml_diff>